<commit_message>
chore(templates): atualizar modelos NIS2 (revisao pos-validacao)
- registo-riscos.xlsx   17430 -> 17563 bytes
- inventario-ativos.xlsx 20299 -> 20476 bytes
- psi-template.docx     23305 -> 23285 bytes

Co-Authored-By: Claude Sonnet 4.6 <noreply@anthropic.com>
</commit_message>
<xml_diff>
--- a/backend/assets/templates/psi-template.docx
+++ b/backend/assets/templates/psi-template.docx
@@ -1780,7 +1780,7 @@
                 <w:sz w:val="20"/>
                 <w:szCs w:val="20"/>
               </w:rPr>
-              <w:t>🔴  CONFIDENCIAL</w:t>
+              <w:t>CONFIDENCIAL</w:t>
             </w:r>
           </w:p>
         </w:tc>
@@ -1899,7 +1899,7 @@
                 <w:sz w:val="20"/>
                 <w:szCs w:val="20"/>
               </w:rPr>
-              <w:t>🟠  INTERNO</w:t>
+              <w:t>INTERNO</w:t>
             </w:r>
           </w:p>
         </w:tc>
@@ -2018,7 +2018,7 @@
                 <w:sz w:val="20"/>
                 <w:szCs w:val="20"/>
               </w:rPr>
-              <w:t>🟡  RESTRITO</w:t>
+              <w:t>RESTRITO</w:t>
             </w:r>
           </w:p>
         </w:tc>
@@ -2137,7 +2137,7 @@
                 <w:sz w:val="20"/>
                 <w:szCs w:val="20"/>
               </w:rPr>
-              <w:t>🟢  PÚBLICO</w:t>
+              <w:t>PÚBLICO</w:t>
             </w:r>
           </w:p>
         </w:tc>

</xml_diff>